<commit_message>
RFQ: add No. of Air Intake and Approx. Dry Weight rows; rename to Approx. Operating Weight
The Selection Summary now takes air intakes and dry weight from the RFQ specification.

Co-Authored-By: Claude Opus 5.5 <noreply@anthropic.com>
</commit_message>
<xml_diff>
--- a/public/templates/rfq.docx
+++ b/public/templates/rfq.docx
@@ -690,7 +690,7 @@
           </w:tcPr>
           <w:p>
             <w:r>
-              <w:t xml:space="preserve">kW Capacity </w:t>
+              <w:t xml:space="preserve">No. of Air Intake</w:t>
             </w:r>
           </w:p>
         </w:tc>
@@ -703,7 +703,7 @@
               <w:jc w:val="center"/>
             </w:pPr>
             <w:r>
-              <w:t>kW</w:t>
+              <w:t>#</w:t>
             </w:r>
           </w:p>
         </w:tc>
@@ -713,7 +713,7 @@
           </w:tcPr>
           <w:p>
             <w:r>
-              <w:t>{spec_kwCapacity}</w:t>
+              <w:t>{spec_airIntakes}</w:t>
             </w:r>
           </w:p>
         </w:tc>
@@ -729,10 +729,7 @@
           </w:tcPr>
           <w:p>
             <w:r>
-              <w:t>Condenser</w:t>
-            </w:r>
-            <w:r>
-              <w:t xml:space="preserve"> Flow Rate </w:t>
+              <w:t xml:space="preserve">kW Capacity </w:t>
             </w:r>
           </w:p>
         </w:tc>
@@ -745,7 +742,7 @@
               <w:jc w:val="center"/>
             </w:pPr>
             <w:r>
-              <w:t>L/s</w:t>
+              <w:t>kW</w:t>
             </w:r>
           </w:p>
         </w:tc>
@@ -755,7 +752,7 @@
           </w:tcPr>
           <w:p>
             <w:r>
-              <w:t>{spec_condenserFlowRate}</w:t>
+              <w:t>{spec_kwCapacity}</w:t>
             </w:r>
           </w:p>
         </w:tc>
@@ -771,7 +768,10 @@
           </w:tcPr>
           <w:p>
             <w:r>
-              <w:t xml:space="preserve">Cond. In Temp </w:t>
+              <w:t>Condenser</w:t>
+            </w:r>
+            <w:r>
+              <w:t xml:space="preserve"> Flow Rate </w:t>
             </w:r>
           </w:p>
         </w:tc>
@@ -784,16 +784,7 @@
               <w:jc w:val="center"/>
             </w:pPr>
             <w:r>
-              <w:t>(</w:t>
-            </w:r>
-            <w:r>
-              <w:rPr>
-                <w:rFonts w:ascii="Cambria Math" w:hAnsi="Cambria Math" w:cs="Cambria Math"/>
-              </w:rPr>
-              <w:t>℃</w:t>
-            </w:r>
-            <w:r>
-              <w:t>)</w:t>
+              <w:t>L/s</w:t>
             </w:r>
           </w:p>
         </w:tc>
@@ -803,7 +794,7 @@
           </w:tcPr>
           <w:p>
             <w:r>
-              <w:t>{spec_condInTemp}</w:t>
+              <w:t>{spec_condenserFlowRate}</w:t>
             </w:r>
           </w:p>
         </w:tc>
@@ -819,7 +810,7 @@
           </w:tcPr>
           <w:p>
             <w:r>
-              <w:t>Cond. Out Temp</w:t>
+              <w:t xml:space="preserve">Cond. In Temp </w:t>
             </w:r>
           </w:p>
         </w:tc>
@@ -851,7 +842,7 @@
           </w:tcPr>
           <w:p>
             <w:r>
-              <w:t>{spec_condOutTemp}</w:t>
+              <w:t>{spec_condInTemp}</w:t>
             </w:r>
           </w:p>
         </w:tc>
@@ -867,10 +858,7 @@
           </w:tcPr>
           <w:p>
             <w:r>
-              <w:t>Wet Bulb Temp</w:t>
-            </w:r>
-            <w:r>
-              <w:tab/>
+              <w:t>Cond. Out Temp</w:t>
             </w:r>
           </w:p>
         </w:tc>
@@ -902,7 +890,7 @@
           </w:tcPr>
           <w:p>
             <w:r>
-              <w:t>{spec_wetBulbTemp}</w:t>
+              <w:t>{spec_condOutTemp}</w:t>
             </w:r>
           </w:p>
         </w:tc>
@@ -918,7 +906,10 @@
           </w:tcPr>
           <w:p>
             <w:r>
-              <w:t>No of Fans</w:t>
+              <w:t>Wet Bulb Temp</w:t>
+            </w:r>
+            <w:r>
+              <w:tab/>
             </w:r>
           </w:p>
         </w:tc>
@@ -931,7 +922,16 @@
               <w:jc w:val="center"/>
             </w:pPr>
             <w:r>
-              <w:t>#</w:t>
+              <w:t>(</w:t>
+            </w:r>
+            <w:r>
+              <w:rPr>
+                <w:rFonts w:ascii="Cambria Math" w:hAnsi="Cambria Math" w:cs="Cambria Math"/>
+              </w:rPr>
+              <w:t>℃</w:t>
+            </w:r>
+            <w:r>
+              <w:t>)</w:t>
             </w:r>
           </w:p>
         </w:tc>
@@ -941,7 +941,7 @@
           </w:tcPr>
           <w:p>
             <w:r>
-              <w:t>{spec_noOfFans}</w:t>
+              <w:t>{spec_wetBulbTemp}</w:t>
             </w:r>
           </w:p>
         </w:tc>
@@ -957,10 +957,7 @@
           </w:tcPr>
           <w:p>
             <w:r>
-              <w:t>Fan kW</w:t>
-            </w:r>
-            <w:r>
-              <w:tab/>
+              <w:t>No of Fans</w:t>
             </w:r>
           </w:p>
         </w:tc>
@@ -973,7 +970,7 @@
               <w:jc w:val="center"/>
             </w:pPr>
             <w:r>
-              <w:t>kW</w:t>
+              <w:t>#</w:t>
             </w:r>
           </w:p>
         </w:tc>
@@ -983,7 +980,7 @@
           </w:tcPr>
           <w:p>
             <w:r>
-              <w:t>{spec_fanKw}</w:t>
+              <w:t>{spec_noOfFans}</w:t>
             </w:r>
           </w:p>
         </w:tc>
@@ -999,7 +996,10 @@
           </w:tcPr>
           <w:p>
             <w:r>
-              <w:t>Fan Drive Type</w:t>
+              <w:t>Fan kW</w:t>
+            </w:r>
+            <w:r>
+              <w:tab/>
             </w:r>
           </w:p>
         </w:tc>
@@ -1011,6 +1011,9 @@
             <w:pPr>
               <w:jc w:val="center"/>
             </w:pPr>
+            <w:r>
+              <w:t>kW</w:t>
+            </w:r>
           </w:p>
         </w:tc>
         <w:tc>
@@ -1019,7 +1022,7 @@
           </w:tcPr>
           <w:p>
             <w:r>
-              <w:t>{spec_fanDriveType}</w:t>
+              <w:t>{spec_fanKw}</w:t>
             </w:r>
           </w:p>
         </w:tc>
@@ -1035,7 +1038,7 @@
           </w:tcPr>
           <w:p>
             <w:r>
-              <w:t>Dimensions</w:t>
+              <w:t>Fan Drive Type</w:t>
             </w:r>
           </w:p>
         </w:tc>
@@ -1047,9 +1050,6 @@
             <w:pPr>
               <w:jc w:val="center"/>
             </w:pPr>
-            <w:r>
-              <w:t>mm</w:t>
-            </w:r>
           </w:p>
         </w:tc>
         <w:tc>
@@ -1058,7 +1058,7 @@
           </w:tcPr>
           <w:p>
             <w:r>
-              <w:t>{spec_dimensions}</w:t>
+              <w:t>{spec_fanDriveType}</w:t>
             </w:r>
           </w:p>
         </w:tc>
@@ -1074,7 +1074,85 @@
           </w:tcPr>
           <w:p>
             <w:r>
-              <w:t>Design Operating Weight</w:t>
+              <w:t>Dimensions</w:t>
+            </w:r>
+          </w:p>
+        </w:tc>
+        <w:tc>
+          <w:tcPr>
+            <w:tcW w:w="1034" w:type="dxa"/>
+          </w:tcPr>
+          <w:p>
+            <w:pPr>
+              <w:jc w:val="center"/>
+            </w:pPr>
+            <w:r>
+              <w:t>mm</w:t>
+            </w:r>
+          </w:p>
+        </w:tc>
+        <w:tc>
+          <w:tcPr>
+            <w:tcW w:w="11090" w:type="dxa"/>
+          </w:tcPr>
+          <w:p>
+            <w:r>
+              <w:t>{spec_dimensions}</w:t>
+            </w:r>
+          </w:p>
+        </w:tc>
+      </w:tr>
+      <w:tr>
+        <w:trPr>
+          <w:gridAfter w:val="1"/>
+          <w:wAfter w:w="50" w:type="dxa"/>
+        </w:trPr>
+        <w:tc>
+          <w:tcPr>
+            <w:tcW w:w="3214" w:type="dxa"/>
+          </w:tcPr>
+          <w:p>
+            <w:r>
+              <w:t>Approx. Dry Weight</w:t>
+            </w:r>
+          </w:p>
+        </w:tc>
+        <w:tc>
+          <w:tcPr>
+            <w:tcW w:w="1034" w:type="dxa"/>
+          </w:tcPr>
+          <w:p>
+            <w:pPr>
+              <w:jc w:val="center"/>
+            </w:pPr>
+            <w:r>
+              <w:t>kg</w:t>
+            </w:r>
+          </w:p>
+        </w:tc>
+        <w:tc>
+          <w:tcPr>
+            <w:tcW w:w="11090" w:type="dxa"/>
+          </w:tcPr>
+          <w:p>
+            <w:r>
+              <w:t>{spec_dryWeight}</w:t>
+            </w:r>
+          </w:p>
+        </w:tc>
+      </w:tr>
+      <w:tr>
+        <w:trPr>
+          <w:gridAfter w:val="1"/>
+          <w:wAfter w:w="50" w:type="dxa"/>
+        </w:trPr>
+        <w:tc>
+          <w:tcPr>
+            <w:tcW w:w="3214" w:type="dxa"/>
+          </w:tcPr>
+          <w:p>
+            <w:r>
+              <w:t>Approx. Operating Weight</w:t>
             </w:r>
           </w:p>
         </w:tc>

</xml_diff>

<commit_message>
Multiple tower types: Scan Document per tower; RFQ and Technical Proposal print every tower
- Each tower in the Cooling Tower Specification has its own Scan Document button (customer details stay shared)
- Technical Proposal cover card: Type + Model per tower, with Add Tower / Remove
- RFQ repeats the spec table per tower type (headed when there's more than one)
- Technical and Commercial covers print one model line per tower type

Co-Authored-By: Claude Opus 5.5 <noreply@anthropic.com>
</commit_message>
<xml_diff>
--- a/public/templates/rfq.docx
+++ b/public/templates/rfq.docx
@@ -484,6 +484,34 @@
         <w:t xml:space="preserve"> </w:t>
       </w:r>
     </w:p>
+    <w:p>
+      <w:r>
+        <w:t xml:space="preserve">{#towerSpecs}</w:t>
+      </w:r>
+    </w:p>
+    <w:p>
+      <w:r>
+        <w:t xml:space="preserve">{#heading}</w:t>
+      </w:r>
+    </w:p>
+    <w:p>
+      <w:pPr>
+        <w:keepNext/>
+        <w:spacing w:before="240"/>
+      </w:pPr>
+      <w:r>
+        <w:rPr>
+          <w:b/>
+          <w:bCs/>
+        </w:rPr>
+        <w:t xml:space="preserve">{heading}</w:t>
+      </w:r>
+    </w:p>
+    <w:p>
+      <w:r>
+        <w:t xml:space="preserve">{/heading}</w:t>
+      </w:r>
+    </w:p>
     <w:tbl>
       <w:tblPr>
         <w:tblStyle w:val="TableGrid"/>
@@ -1181,6 +1209,11 @@
         </w:tc>
       </w:tr>
     </w:tbl>
+    <w:p>
+      <w:r>
+        <w:t xml:space="preserve">{/towerSpecs}</w:t>
+      </w:r>
+    </w:p>
     <w:p>
       <w:pPr>
         <w:spacing w:after="0" w:line="240" w:lineRule="auto"/>

</xml_diff>